<commit_message>
Fix Managed IT quote facts and approved document wording
</commit_message>
<xml_diff>
--- a/test/fixtures/COM-PRP-v1.8.docx
+++ b/test/fixtures/COM-PRP-v1.8.docx
@@ -4454,7 +4454,7 @@
           <w:sz w:val="19"/>
           <w:szCs w:val="19"/>
         </w:rPr>
-        <w:t xml:space="preserve">To accept, reply to this Quote in writing. The IT Guys will then send the Master Services Agreement, Client Service Schedule</w:t>
+        <w:t xml:space="preserve">To accept, reply to this Quote in writing. The IT Guys will then send the Master Services Agreement and Client Service Schedule</w:t>
       </w:r>
       <w:sdt>
         <w:sdtPr>
@@ -4473,7 +4473,7 @@
               <w:sz w:val="19"/>
               <w:szCs w:val="19"/>
             </w:rPr>
-            <w:t xml:space="preserve">[ and Business Associate Agreement — delete if no health information]</w:t>
+            <w:t xml:space="preserve">[, plus a Business Associate Agreement, — only if health information]</w:t>
           </w:r>
         </w:sdtContent>
       </w:sdt>

</xml_diff>